<commit_message>
Corregido el error de presentación con las comillas dobles
</commit_message>
<xml_diff>
--- a/multichoice/build/es_electric_digital.docx
+++ b/multichoice/build/es_electric_digital.docx
@@ -151,7 +151,7 @@
       <w:r>
         <w:t>a)</w:t>
         <w:tab/>
-        <w:t>Puerta NOT</w:t>
+        <w:t>Puerta XOR</w:t>
       </w:r>
     </w:p>
     <w:p>
@@ -160,6 +160,16 @@
       </w:pPr>
       <w:r>
         <w:t>b)</w:t>
+        <w:tab/>
+        <w:t>Puerta NOR</w:t>
+      </w:r>
+    </w:p>
+    <w:p>
+      <w:pPr>
+        <w:pStyle w:val="Choice"/>
+      </w:pPr>
+      <w:r>
+        <w:t>c)</w:t>
         <w:tab/>
         <w:t>Puerta NAND</w:t>
       </w:r>
@@ -169,19 +179,9 @@
         <w:pStyle w:val="Choice"/>
       </w:pPr>
       <w:r>
-        <w:t>c)</w:t>
-        <w:tab/>
-        <w:t>Puerta XOR</w:t>
-      </w:r>
-    </w:p>
-    <w:p>
-      <w:pPr>
-        <w:pStyle w:val="Choice"/>
-      </w:pPr>
-      <w:r>
         <w:t>d)</w:t>
         <w:tab/>
-        <w:t>Puerta NOR</w:t>
+        <w:t>Puerta NOT</w:t>
       </w:r>
     </w:p>
     <w:p>
@@ -258,7 +258,7 @@
       <w:r>
         <w:t>c)</w:t>
         <w:tab/>
-        <w:t>Puerta NOT</w:t>
+        <w:t>Puerta AND</w:t>
       </w:r>
     </w:p>
     <w:p>
@@ -268,7 +268,7 @@
       <w:r>
         <w:t>d)</w:t>
         <w:tab/>
-        <w:t>Puerta AND</w:t>
+        <w:t>Puerta NOT</w:t>
       </w:r>
     </w:p>
     <w:p>
@@ -325,7 +325,7 @@
       <w:r>
         <w:t>a)</w:t>
         <w:tab/>
-        <w:t>Puerta NOR</w:t>
+        <w:t>Puerta NOT</w:t>
       </w:r>
     </w:p>
     <w:p>
@@ -355,7 +355,7 @@
       <w:r>
         <w:t>d)</w:t>
         <w:tab/>
-        <w:t>Puerta NOT</w:t>
+        <w:t>Puerta NOR</w:t>
       </w:r>
     </w:p>
     <w:p>
@@ -422,16 +422,6 @@
       <w:r>
         <w:t>b)</w:t>
         <w:tab/>
-        <w:t>Puerta OR</w:t>
-      </w:r>
-    </w:p>
-    <w:p>
-      <w:pPr>
-        <w:pStyle w:val="Choice"/>
-      </w:pPr>
-      <w:r>
-        <w:t>c)</w:t>
-        <w:tab/>
         <w:t>Puerta AND</w:t>
       </w:r>
     </w:p>
@@ -440,9 +430,19 @@
         <w:pStyle w:val="Choice"/>
       </w:pPr>
       <w:r>
+        <w:t>c)</w:t>
+        <w:tab/>
+        <w:t>Puerta NOT</w:t>
+      </w:r>
+    </w:p>
+    <w:p>
+      <w:pPr>
+        <w:pStyle w:val="Choice"/>
+      </w:pPr>
+      <w:r>
         <w:t>d)</w:t>
         <w:tab/>
-        <w:t>Puerta NOT</w:t>
+        <w:t>Puerta OR</w:t>
       </w:r>
     </w:p>
     <w:p>
@@ -499,6 +499,16 @@
       <w:r>
         <w:t>a)</w:t>
         <w:tab/>
+        <w:t>Puerta NOT</w:t>
+      </w:r>
+    </w:p>
+    <w:p>
+      <w:pPr>
+        <w:pStyle w:val="Choice"/>
+      </w:pPr>
+      <w:r>
+        <w:t>b)</w:t>
+        <w:tab/>
         <w:t>Puerta XOR</w:t>
       </w:r>
     </w:p>
@@ -507,33 +517,23 @@
         <w:pStyle w:val="Choice"/>
       </w:pPr>
       <w:r>
-        <w:t>b)</w:t>
+        <w:t>c)</w:t>
+        <w:tab/>
+        <w:t>Puerta NOR</w:t>
+      </w:r>
+    </w:p>
+    <w:p>
+      <w:pPr>
+        <w:pStyle w:val="Choice"/>
+      </w:pPr>
+      <w:r>
+        <w:t>d)</w:t>
         <w:tab/>
         <w:t>Puerta NAND</w:t>
       </w:r>
     </w:p>
     <w:p>
       <w:pPr>
-        <w:pStyle w:val="Choice"/>
-      </w:pPr>
-      <w:r>
-        <w:t>c)</w:t>
-        <w:tab/>
-        <w:t>Puerta NOT</w:t>
-      </w:r>
-    </w:p>
-    <w:p>
-      <w:pPr>
-        <w:pStyle w:val="Choice"/>
-      </w:pPr>
-      <w:r>
-        <w:t>d)</w:t>
-        <w:tab/>
-        <w:t>Puerta NOR</w:t>
-      </w:r>
-    </w:p>
-    <w:p>
-      <w:pPr>
         <w:pStyle w:val="ListNumber"/>
       </w:pPr>
       <w:r>
@@ -547,7 +547,7 @@
       <w:r>
         <w:t>a)</w:t>
         <w:tab/>
-        <w:t>El transistor</w:t>
+        <w:t>El condensador</w:t>
       </w:r>
     </w:p>
     <w:p>
@@ -557,7 +557,7 @@
       <w:r>
         <w:t>b)</w:t>
         <w:tab/>
-        <w:t>El condensador</w:t>
+        <w:t>El transistor</w:t>
       </w:r>
     </w:p>
     <w:p>
@@ -615,7 +615,7 @@
       <w:r>
         <w:t>c)</w:t>
         <w:tab/>
-        <w:t>TOR</w:t>
+        <w:t>NOR</w:t>
       </w:r>
     </w:p>
     <w:p>
@@ -625,7 +625,7 @@
       <w:r>
         <w:t>d)</w:t>
         <w:tab/>
-        <w:t>NOR</w:t>
+        <w:t>TOR</w:t>
       </w:r>
     </w:p>
     <w:p>
@@ -682,6 +682,16 @@
       <w:r>
         <w:t>a)</w:t>
         <w:tab/>
+        <w:t>NOT</w:t>
+      </w:r>
+    </w:p>
+    <w:p>
+      <w:pPr>
+        <w:pStyle w:val="Choice"/>
+      </w:pPr>
+      <w:r>
+        <w:t>b)</w:t>
+        <w:tab/>
         <w:t>AND</w:t>
       </w:r>
     </w:p>
@@ -690,19 +700,9 @@
         <w:pStyle w:val="Choice"/>
       </w:pPr>
       <w:r>
-        <w:t>b)</w:t>
+        <w:t>c)</w:t>
         <w:tab/>
         <w:t>NOR</w:t>
-      </w:r>
-    </w:p>
-    <w:p>
-      <w:pPr>
-        <w:pStyle w:val="Choice"/>
-      </w:pPr>
-      <w:r>
-        <w:t>c)</w:t>
-        <w:tab/>
-        <w:t>NOT</w:t>
       </w:r>
     </w:p>
     <w:p>
@@ -769,6 +769,16 @@
       <w:r>
         <w:t>a)</w:t>
         <w:tab/>
+        <w:t>NOR</w:t>
+      </w:r>
+    </w:p>
+    <w:p>
+      <w:pPr>
+        <w:pStyle w:val="Choice"/>
+      </w:pPr>
+      <w:r>
+        <w:t>b)</w:t>
+        <w:tab/>
         <w:t>NOT</w:t>
       </w:r>
     </w:p>
@@ -777,19 +787,9 @@
         <w:pStyle w:val="Choice"/>
       </w:pPr>
       <w:r>
-        <w:t>b)</w:t>
+        <w:t>c)</w:t>
         <w:tab/>
         <w:t>OR</w:t>
-      </w:r>
-    </w:p>
-    <w:p>
-      <w:pPr>
-        <w:pStyle w:val="Choice"/>
-      </w:pPr>
-      <w:r>
-        <w:t>c)</w:t>
-        <w:tab/>
-        <w:t>NOR</w:t>
       </w:r>
     </w:p>
     <w:p>
@@ -866,7 +866,7 @@
       <w:r>
         <w:t>b)</w:t>
         <w:tab/>
-        <w:t>NOR</w:t>
+        <w:t>AND</w:t>
       </w:r>
     </w:p>
     <w:p>
@@ -876,7 +876,7 @@
       <w:r>
         <w:t>c)</w:t>
         <w:tab/>
-        <w:t>AND</w:t>
+        <w:t>NOR</w:t>
       </w:r>
     </w:p>
     <w:p>
@@ -943,7 +943,7 @@
       <w:r>
         <w:t>a)</w:t>
         <w:tab/>
-        <w:t>NOR</w:t>
+        <w:t>OR</w:t>
       </w:r>
     </w:p>
     <w:p>
@@ -952,6 +952,16 @@
       </w:pPr>
       <w:r>
         <w:t>b)</w:t>
+        <w:tab/>
+        <w:t>NOT</w:t>
+      </w:r>
+    </w:p>
+    <w:p>
+      <w:pPr>
+        <w:pStyle w:val="Choice"/>
+      </w:pPr>
+      <w:r>
+        <w:t>c)</w:t>
         <w:tab/>
         <w:t>XNOR</w:t>
       </w:r>
@@ -961,19 +971,9 @@
         <w:pStyle w:val="Choice"/>
       </w:pPr>
       <w:r>
-        <w:t>c)</w:t>
-        <w:tab/>
-        <w:t>NOT</w:t>
-      </w:r>
-    </w:p>
-    <w:p>
-      <w:pPr>
-        <w:pStyle w:val="Choice"/>
-      </w:pPr>
-      <w:r>
         <w:t>d)</w:t>
         <w:tab/>
-        <w:t>OR</w:t>
+        <w:t>NOR</w:t>
       </w:r>
     </w:p>
     <w:p>
@@ -1030,7 +1030,7 @@
       <w:r>
         <w:t>a)</w:t>
         <w:tab/>
-        <w:t>XOR</w:t>
+        <w:t>Ninguna</w:t>
       </w:r>
     </w:p>
     <w:p>
@@ -1040,7 +1040,7 @@
       <w:r>
         <w:t>b)</w:t>
         <w:tab/>
-        <w:t>AND</w:t>
+        <w:t>XOR</w:t>
       </w:r>
     </w:p>
     <w:p>
@@ -1060,7 +1060,7 @@
       <w:r>
         <w:t>d)</w:t>
         <w:tab/>
-        <w:t>Ninguna</w:t>
+        <w:t>AND</w:t>
       </w:r>
     </w:p>
     <w:p>
@@ -1127,7 +1127,7 @@
       <w:r>
         <w:t>b)</w:t>
         <w:tab/>
-        <w:t>OR</w:t>
+        <w:t>XNOR</w:t>
       </w:r>
     </w:p>
     <w:p>
@@ -1147,7 +1147,7 @@
       <w:r>
         <w:t>d)</w:t>
         <w:tab/>
-        <w:t>XNOR</w:t>
+        <w:t>OR</w:t>
       </w:r>
     </w:p>
     <w:p>
@@ -1214,7 +1214,7 @@
       <w:r>
         <w:t>b)</w:t>
         <w:tab/>
-        <w:t>NAND</w:t>
+        <w:t>XNOR</w:t>
       </w:r>
     </w:p>
     <w:p>
@@ -1234,7 +1234,7 @@
       <w:r>
         <w:t>d)</w:t>
         <w:tab/>
-        <w:t>XNOR</w:t>
+        <w:t>NAND</w:t>
       </w:r>
     </w:p>
     <w:p>
@@ -1301,6 +1301,16 @@
       <w:r>
         <w:t>b)</w:t>
         <w:tab/>
+        <w:t>NOT</w:t>
+      </w:r>
+    </w:p>
+    <w:p>
+      <w:pPr>
+        <w:pStyle w:val="Choice"/>
+      </w:pPr>
+      <w:r>
+        <w:t>c)</w:t>
+        <w:tab/>
         <w:t>AND</w:t>
       </w:r>
     </w:p>
@@ -1309,27 +1319,27 @@
         <w:pStyle w:val="Choice"/>
       </w:pPr>
       <w:r>
-        <w:t>c)</w:t>
+        <w:t>d)</w:t>
         <w:tab/>
         <w:t>XOR</w:t>
       </w:r>
     </w:p>
     <w:p>
       <w:pPr>
-        <w:pStyle w:val="Choice"/>
+        <w:pStyle w:val="ListNumber"/>
       </w:pPr>
       <w:r>
-        <w:t>d)</w:t>
-        <w:tab/>
-        <w:t>NOT</w:t>
+        <w:t>¿Quién publicó en 1854 "Las leyes del pensamiento", el libro con las bases de la lógica digital?</w:t>
       </w:r>
     </w:p>
     <w:p>
       <w:pPr>
-        <w:pStyle w:val="ListNumber"/>
+        <w:pStyle w:val="Choice"/>
       </w:pPr>
       <w:r>
-        <w:t>¿Quién publicó en 1854 \"Las leyes del pensamiento\", el libro con las bases de la lógica digital?</w:t>
+        <w:t>a)</w:t>
+        <w:tab/>
+        <w:t>Charles Babbage</w:t>
       </w:r>
     </w:p>
     <w:p>
@@ -1337,7 +1347,17 @@
         <w:pStyle w:val="Choice"/>
       </w:pPr>
       <w:r>
-        <w:t>a)</w:t>
+        <w:t>b)</w:t>
+        <w:tab/>
+        <w:t>George Boole</w:t>
+      </w:r>
+    </w:p>
+    <w:p>
+      <w:pPr>
+        <w:pStyle w:val="Choice"/>
+      </w:pPr>
+      <w:r>
+        <w:t>c)</w:t>
         <w:tab/>
         <w:t>Bill Gates</w:t>
       </w:r>
@@ -1347,19 +1367,17 @@
         <w:pStyle w:val="Choice"/>
       </w:pPr>
       <w:r>
-        <w:t>b)</w:t>
+        <w:t>d)</w:t>
         <w:tab/>
         <w:t>William Shockley</w:t>
       </w:r>
     </w:p>
     <w:p>
       <w:pPr>
-        <w:pStyle w:val="Choice"/>
+        <w:pStyle w:val="ListNumber"/>
       </w:pPr>
       <w:r>
-        <w:t>c)</w:t>
-        <w:tab/>
-        <w:t>Charles Babbage</w:t>
+        <w:t>¿En qué año publicó George Boole el libro "Las leyes del pensamiento", que consideramos el comienzo de la lógica digital?</w:t>
       </w:r>
     </w:p>
     <w:p>
@@ -1367,37 +1385,19 @@
         <w:pStyle w:val="Choice"/>
       </w:pPr>
       <w:r>
-        <w:t>d)</w:t>
+        <w:t>a)</w:t>
         <w:tab/>
-        <w:t>George Boole</w:t>
+        <w:t>1854</w:t>
       </w:r>
     </w:p>
     <w:p>
       <w:pPr>
-        <w:pStyle w:val="ListNumber"/>
-      </w:pPr>
-      <w:r>
-        <w:t>¿En qué año publicó George Boole el libro \"Las leyes del pensamiento\", que consideramos el comienzo de la lógica digital?</w:t>
-      </w:r>
-    </w:p>
-    <w:p>
-      <w:pPr>
-        <w:pStyle w:val="Choice"/>
-      </w:pPr>
-      <w:r>
-        <w:t>a)</w:t>
-        <w:tab/>
-        <w:t>1934</w:t>
-      </w:r>
-    </w:p>
-    <w:p>
-      <w:pPr>
         <w:pStyle w:val="Choice"/>
       </w:pPr>
       <w:r>
         <w:t>b)</w:t>
         <w:tab/>
-        <w:t>1904</w:t>
+        <w:t>1934</w:t>
       </w:r>
     </w:p>
     <w:p>
@@ -1417,7 +1417,7 @@
       <w:r>
         <w:t>d)</w:t>
         <w:tab/>
-        <w:t>1854</w:t>
+        <w:t>1904</w:t>
       </w:r>
     </w:p>
     <w:p>
@@ -1474,7 +1474,7 @@
       <w:r>
         <w:t>a)</w:t>
         <w:tab/>
-        <w:t>AND</w:t>
+        <w:t>NAND</w:t>
       </w:r>
     </w:p>
     <w:p>
@@ -1483,6 +1483,16 @@
       </w:pPr>
       <w:r>
         <w:t>b)</w:t>
+        <w:tab/>
+        <w:t>NOR</w:t>
+      </w:r>
+    </w:p>
+    <w:p>
+      <w:pPr>
+        <w:pStyle w:val="Choice"/>
+      </w:pPr>
+      <w:r>
+        <w:t>c)</w:t>
         <w:tab/>
         <w:t>OR</w:t>
       </w:r>
@@ -1492,19 +1502,9 @@
         <w:pStyle w:val="Choice"/>
       </w:pPr>
       <w:r>
-        <w:t>c)</w:t>
-        <w:tab/>
-        <w:t>NAND</w:t>
-      </w:r>
-    </w:p>
-    <w:p>
-      <w:pPr>
-        <w:pStyle w:val="Choice"/>
-      </w:pPr>
-      <w:r>
         <w:t>d)</w:t>
         <w:tab/>
-        <w:t>NOR</w:t>
+        <w:t>AND</w:t>
       </w:r>
     </w:p>
     <w:p>
@@ -1561,16 +1561,6 @@
       <w:r>
         <w:t>a)</w:t>
         <w:tab/>
-        <w:t>AND</w:t>
-      </w:r>
-    </w:p>
-    <w:p>
-      <w:pPr>
-        <w:pStyle w:val="Choice"/>
-      </w:pPr>
-      <w:r>
-        <w:t>b)</w:t>
-        <w:tab/>
         <w:t>OR</w:t>
       </w:r>
     </w:p>
@@ -1579,9 +1569,19 @@
         <w:pStyle w:val="Choice"/>
       </w:pPr>
       <w:r>
+        <w:t>b)</w:t>
+        <w:tab/>
+        <w:t>NOR</w:t>
+      </w:r>
+    </w:p>
+    <w:p>
+      <w:pPr>
+        <w:pStyle w:val="Choice"/>
+      </w:pPr>
+      <w:r>
         <w:t>c)</w:t>
         <w:tab/>
-        <w:t>NOR</w:t>
+        <w:t>AND</w:t>
       </w:r>
     </w:p>
     <w:p>
@@ -1648,7 +1648,7 @@
       <w:r>
         <w:t>a)</w:t>
         <w:tab/>
-        <w:t>OR</w:t>
+        <w:t>NAND</w:t>
       </w:r>
     </w:p>
     <w:p>
@@ -1658,7 +1658,7 @@
       <w:r>
         <w:t>b)</w:t>
         <w:tab/>
-        <w:t>NAND</w:t>
+        <w:t>NOR</w:t>
       </w:r>
     </w:p>
     <w:p>
@@ -1678,7 +1678,7 @@
       <w:r>
         <w:t>d)</w:t>
         <w:tab/>
-        <w:t>NOR</w:t>
+        <w:t>OR</w:t>
       </w:r>
     </w:p>
     <w:p>
@@ -1735,7 +1735,7 @@
       <w:r>
         <w:t>a)</w:t>
         <w:tab/>
-        <w:t>NAND</w:t>
+        <w:t>AND</w:t>
       </w:r>
     </w:p>
     <w:p>
@@ -1755,7 +1755,7 @@
       <w:r>
         <w:t>c)</w:t>
         <w:tab/>
-        <w:t>AND</w:t>
+        <w:t>NAND</w:t>
       </w:r>
     </w:p>
     <w:p>
@@ -1822,7 +1822,7 @@
       <w:r>
         <w:t>a)</w:t>
         <w:tab/>
-        <w:t>NOT</w:t>
+        <w:t>NOR</w:t>
       </w:r>
     </w:p>
     <w:p>
@@ -1832,7 +1832,7 @@
       <w:r>
         <w:t>b)</w:t>
         <w:tab/>
-        <w:t>NOR</w:t>
+        <w:t>NOT</w:t>
       </w:r>
     </w:p>
     <w:p>
@@ -1909,6 +1909,16 @@
       <w:r>
         <w:t>a)</w:t>
         <w:tab/>
+        <w:t>XOR</w:t>
+      </w:r>
+    </w:p>
+    <w:p>
+      <w:pPr>
+        <w:pStyle w:val="Choice"/>
+      </w:pPr>
+      <w:r>
+        <w:t>b)</w:t>
+        <w:tab/>
         <w:t>AND</w:t>
       </w:r>
     </w:p>
@@ -1917,9 +1927,9 @@
         <w:pStyle w:val="Choice"/>
       </w:pPr>
       <w:r>
-        <w:t>b)</w:t>
+        <w:t>c)</w:t>
         <w:tab/>
-        <w:t>XOR</w:t>
+        <w:t>OR</w:t>
       </w:r>
     </w:p>
     <w:p>
@@ -1927,19 +1937,9 @@
         <w:pStyle w:val="Choice"/>
       </w:pPr>
       <w:r>
-        <w:t>c)</w:t>
+        <w:t>d)</w:t>
         <w:tab/>
         <w:t>NOT</w:t>
-      </w:r>
-    </w:p>
-    <w:p>
-      <w:pPr>
-        <w:pStyle w:val="Choice"/>
-      </w:pPr>
-      <w:r>
-        <w:t>d)</w:t>
-        <w:tab/>
-        <w:t>OR</w:t>
       </w:r>
     </w:p>
     <w:p>
@@ -1996,6 +1996,16 @@
       <w:r>
         <w:t>a)</w:t>
         <w:tab/>
+        <w:t>AND</w:t>
+      </w:r>
+    </w:p>
+    <w:p>
+      <w:pPr>
+        <w:pStyle w:val="Choice"/>
+      </w:pPr>
+      <w:r>
+        <w:t>b)</w:t>
+        <w:tab/>
         <w:t>OR</w:t>
       </w:r>
     </w:p>
@@ -2004,7 +2014,7 @@
         <w:pStyle w:val="Choice"/>
       </w:pPr>
       <w:r>
-        <w:t>b)</w:t>
+        <w:t>c)</w:t>
         <w:tab/>
         <w:t>NOT</w:t>
       </w:r>
@@ -2014,19 +2024,9 @@
         <w:pStyle w:val="Choice"/>
       </w:pPr>
       <w:r>
-        <w:t>c)</w:t>
+        <w:t>d)</w:t>
         <w:tab/>
         <w:t>XOR</w:t>
-      </w:r>
-    </w:p>
-    <w:p>
-      <w:pPr>
-        <w:pStyle w:val="Choice"/>
-      </w:pPr>
-      <w:r>
-        <w:t>d)</w:t>
-        <w:tab/>
-        <w:t>AND</w:t>
       </w:r>
     </w:p>
     <w:p>
@@ -2083,7 +2083,7 @@
       <w:r>
         <w:t>a)</w:t>
         <w:tab/>
-        <w:t>AND</w:t>
+        <w:t>OR</w:t>
       </w:r>
     </w:p>
     <w:p>
@@ -2103,7 +2103,7 @@
       <w:r>
         <w:t>c)</w:t>
         <w:tab/>
-        <w:t>NOT</w:t>
+        <w:t>AND</w:t>
       </w:r>
     </w:p>
     <w:p>
@@ -2113,7 +2113,7 @@
       <w:r>
         <w:t>d)</w:t>
         <w:tab/>
-        <w:t>OR</w:t>
+        <w:t>NOT</w:t>
       </w:r>
     </w:p>
     <w:p>
@@ -2257,7 +2257,7 @@
       <w:r>
         <w:t>a)</w:t>
         <w:tab/>
-        <w:t>AND</w:t>
+        <w:t>XOR</w:t>
       </w:r>
     </w:p>
     <w:p>
@@ -2267,7 +2267,7 @@
       <w:r>
         <w:t>b)</w:t>
         <w:tab/>
-        <w:t>XOR</w:t>
+        <w:t>XNOR</w:t>
       </w:r>
     </w:p>
     <w:p>
@@ -2287,7 +2287,7 @@
       <w:r>
         <w:t>d)</w:t>
         <w:tab/>
-        <w:t>XNOR</w:t>
+        <w:t>AND</w:t>
       </w:r>
     </w:p>
     <w:p>
@@ -2354,7 +2354,7 @@
       <w:r>
         <w:t>b)</w:t>
         <w:tab/>
-        <w:t>NOR</w:t>
+        <w:t>OR</w:t>
       </w:r>
     </w:p>
     <w:p>
@@ -2364,7 +2364,7 @@
       <w:r>
         <w:t>c)</w:t>
         <w:tab/>
-        <w:t>OR</w:t>
+        <w:t>NOR</w:t>
       </w:r>
     </w:p>
     <w:p>

</xml_diff>